<commit_message>
docs: complement technical schedule docx with Wokwi simulation improvements (serial commands, LED blinking, and non-blocking FSM)
</commit_message>
<xml_diff>
--- a/Cronograma_EvaluacionTecnica_JairMolina.docx
+++ b/Cronograma_EvaluacionTecnica_JairMolina.docx
@@ -6320,6 +6320,54 @@
         </w:tc>
       </w:tr>
     </w:tbl>
+    <w:p>
+      <w:pPr>
+        <w:pStyle w:val="Heading1"/>
+      </w:pPr>
+      <w:r>
+        <w:t>8. Mejoras y Optimizaciones Implementadas en la Simulación Wokwi (C++/Arduino)</w:t>
+      </w:r>
+    </w:p>
+    <w:p>
+      <w:r>
+        <w:t>Durante el desarrollo de la simulación en Wokwi (sketch.ino), se implementaron mejoras sustanciales para facilitar la evaluación técnica y cumplir rigurosamente con los requerimientos del PDF original:</w:t>
+      </w:r>
+    </w:p>
+    <w:p>
+      <w:r>
+        <w:t>1. Parpadeo Dinámico del Ventilador: Para simular la máxima capacidad de extracción solicitada en los requerimientos, el LED indicador del ventilador parpadea a una frecuencia de 150ms cuando la temperatura interna es mayor o igual a 60°C, manteniendo un encendido fijo a temperaturas menores.</w:t>
+      </w:r>
+    </w:p>
+    <w:p>
+      <w:r>
+        <w:t>2. Comandos vía Monitor Serial: Se implementó una interfaz de comandos por terminal para facilitar la demostración de la simulación sin la necesidad de manipular físicamente los componentes iterativamente:</w:t>
+      </w:r>
+    </w:p>
+    <w:p>
+      <w:r>
+        <w:t xml:space="preserve">  - SET:XX -&gt; Fija manualmente la temperatura de activación (Setpoint), anulando la lectura del DIP switch.</w:t>
+      </w:r>
+    </w:p>
+    <w:p>
+      <w:r>
+        <w:t xml:space="preserve">  - TEMP:XX -&gt; Inyecta una temperatura interna simulada de forma instantánea.</w:t>
+      </w:r>
+    </w:p>
+    <w:p>
+      <w:r>
+        <w:t xml:space="preserve">  - EXT:XX -&gt; Fija de forma manual la temperatura exterior simulada.</w:t>
+      </w:r>
+    </w:p>
+    <w:p>
+      <w:r>
+        <w:t>3. Lógica FSM No Bloqueante: Todo el código de la máquina de estados y las transiciones (como el tiempo de viaje de la compuerta de ~3 segundos) fue rediseñado usando millis() para garantizar que el loop principal nunca se bloquee, manteniendo la frecuencia de control a 1 Hz estricto.</w:t>
+      </w:r>
+    </w:p>
+    <w:p>
+      <w:r>
+        <w:t>4. Remoción de inyecciones automáticas: Se eliminaron los retardos forzados (delays) que inyectaban temperatura al mover el DIP switch, delegando esta función a los comandos Serial para una simulación térmica más pura y controlable.</w:t>
+      </w:r>
+    </w:p>
     <w:sectPr>
       <w:headerReference w:type="default" r:id="rId9"/>
       <w:footerReference w:type="default" r:id="rId10"/>

</xml_diff>

<commit_message>
docs: update Wokwi URL to user's new template link
</commit_message>
<xml_diff>
--- a/Cronograma_EvaluacionTecnica_JairMolina.docx
+++ b/Cronograma_EvaluacionTecnica_JairMolina.docx
@@ -3471,14 +3471,7 @@
         <w:ind w:left="432"/>
       </w:pPr>
       <w:r>
-        <w:rPr>
-          <w:rFonts w:ascii="Calibri" w:hAnsi="Calibri"/>
-          <w:b w:val="0"/>
-          <w:i w:val="0"/>
-          <w:color w:val="0F172A"/>
-          <w:sz w:val="20"/>
-        </w:rPr>
-        <w:t>Abrir plantilla base: https://wokwi.com/projects/468207977283145729</w:t>
+        <w:t>Abrir plantilla base: https://wokwi.com/projects/468449090390286337</w:t>
       </w:r>
     </w:p>
     <w:p>

</xml_diff>

<commit_message>
chore: version 1.1.2 - Agregados planos de cobre y organizacion de archivos
</commit_message>
<xml_diff>
--- a/Cronograma_EvaluacionTecnica_JairMolina.docx
+++ b/Cronograma_EvaluacionTecnica_JairMolina.docx
@@ -2984,93 +2984,86 @@
         </w:tc>
       </w:tr>
     </w:tbl>
-    <w:p/>
     <w:p>
-      <w:pPr>
-        <w:pStyle w:val="ListBullet"/>
-        <w:spacing w:before="20" w:after="20"/>
-        <w:ind w:left="432"/>
-      </w:pPr>
+      <w:pPr/>
+      <w:r/>
       <w:r>
         <w:rPr>
-          <w:rFonts w:ascii="Calibri" w:hAnsi="Calibri"/>
-          <w:b w:val="0"/>
-          <w:i w:val="0"/>
-          <w:color w:val="0F172A"/>
-          <w:sz w:val="20"/>
+          <w:b/>
         </w:rPr>
-        <w:t>Revisar datasheets completos: NTC TT05-10KC8-1S-T105-1500, TB6612FNG, FIT0803, MR1238E48B-FSR.</w:t>
+        <w:t>Fase ejecutada y completada con éxito.</w:t>
+        <w:br/>
+      </w:r>
+      <w:r>
+        <w:rPr>
+          <w:b/>
+        </w:rPr>
+        <w:t xml:space="preserve">• Arquitectura FSM: </w:t>
+      </w:r>
+      <w:r>
+        <w:t>Se diseñó e implementó la Máquina de Estados Finitos en MicroPython con los estados INIT, READING, COOLING, IDLE y ERROR. Se implementó un flujo no bloqueante para mantener un escaneo térmico constante a 1 Hz.</w:t>
+        <w:br/>
+      </w:r>
+      <w:r>
+        <w:rPr>
+          <w:b/>
+        </w:rPr>
+        <w:t xml:space="preserve">• Adquisición Analógica: </w:t>
+      </w:r>
+      <w:r>
+        <w:t>Se desarrolló el módulo adc_ntc.py aplicando la ecuación Beta (B=3435K validado con datasheet TEWA) y un buffer circular de 8 muestras con promedio móvil recortado (trimmed mean) para rechazo de ruido.</w:t>
+        <w:br/>
+      </w:r>
+      <w:r>
+        <w:rPr>
+          <w:b/>
+        </w:rPr>
+        <w:t xml:space="preserve">• Control de Potencia: </w:t>
+      </w:r>
+      <w:r>
+        <w:t>Se implementó hbridge.py para manejar el actuador FIT0803 y fan.py para el MOSFET del extractor a 48V. Se integró un Watchdog Timer (WDT) de 8s, alimentándolo en ráfagas de 500ms durante el movimiento síncrono del actuador (3s) para garantizar un estado seguro sin falsos reinicios.</w:t>
+        <w:br/>
       </w:r>
     </w:p>
     <w:p>
       <w:pPr>
-        <w:pStyle w:val="ListBullet"/>
         <w:spacing w:before="20" w:after="20"/>
         <w:ind w:left="432"/>
       </w:pPr>
-      <w:r>
-        <w:rPr>
-          <w:rFonts w:ascii="Calibri" w:hAnsi="Calibri"/>
-          <w:b w:val="0"/>
-          <w:i w:val="0"/>
-          <w:color w:val="0F172A"/>
-          <w:sz w:val="20"/>
-        </w:rPr>
-        <w:t>Calcular resistencia de referencia para divisor NTC: R_ref = 10kΩ (igual a R₀ para maximizar sensibilidad a 25°C).</w:t>
-      </w:r>
+      <w:r/>
     </w:p>
     <w:p>
       <w:pPr>
-        <w:pStyle w:val="ListBullet"/>
         <w:spacing w:before="20" w:after="20"/>
         <w:ind w:left="432"/>
       </w:pPr>
-      <w:r>
-        <w:rPr>
-          <w:rFonts w:ascii="Calibri" w:hAnsi="Calibri"/>
-          <w:b w:val="0"/>
-          <w:i w:val="0"/>
-          <w:color w:val="0F172A"/>
-          <w:sz w:val="20"/>
-        </w:rPr>
-        <w:t>Verificar mapeo GPIO en Seeed XIAO RP2350 vs Raspberry Pi Pico — encapsulados difieren.</w:t>
-      </w:r>
+      <w:r/>
     </w:p>
     <w:p>
       <w:pPr>
-        <w:pStyle w:val="ListBullet"/>
         <w:spacing w:before="20" w:after="20"/>
         <w:ind w:left="432"/>
       </w:pPr>
-      <w:r>
-        <w:rPr>
-          <w:rFonts w:ascii="Calibri" w:hAnsi="Calibri"/>
-          <w:b w:val="0"/>
-          <w:i w:val="0"/>
-          <w:color w:val="0F172A"/>
-          <w:sz w:val="20"/>
-        </w:rPr>
-        <w:t>Establecer ecuación Beta con B=3435K para conversión NTC→°C (corregido per datasheet TEWA/TME).</w:t>
-      </w:r>
+      <w:r/>
     </w:p>
     <w:p>
       <w:pPr>
-        <w:pStyle w:val="ListBullet"/>
         <w:spacing w:before="20" w:after="20"/>
         <w:ind w:left="432"/>
       </w:pPr>
-      <w:r>
-        <w:rPr>
-          <w:rFonts w:ascii="Calibri" w:hAnsi="Calibri"/>
-          <w:b w:val="0"/>
-          <w:i w:val="0"/>
-          <w:color w:val="0F172A"/>
-          <w:sz w:val="20"/>
-        </w:rPr>
-        <w:t>Definir tabla de setpoints DIP: 8 combinaciones de SW3-SW2-SW1 (40°C a 75°C en pasos de 5°C).</w:t>
-      </w:r>
+      <w:r/>
     </w:p>
-    <w:p/>
+    <w:p>
+      <w:pPr>
+        <w:spacing w:before="20" w:after="20"/>
+        <w:ind w:left="432"/>
+      </w:pPr>
+      <w:r/>
+    </w:p>
+    <w:p>
+      <w:pPr/>
+      <w:r/>
+    </w:p>
     <w:tbl>
       <w:tblPr>
         <w:tblStyle w:val="TableGrid"/>
@@ -3110,93 +3103,49 @@
         </w:tc>
       </w:tr>
     </w:tbl>
-    <w:p/>
+    <w:p>
+      <w:pPr/>
+      <w:r/>
+    </w:p>
     <w:p>
       <w:pPr>
-        <w:pStyle w:val="ListBullet"/>
         <w:spacing w:before="20" w:after="20"/>
         <w:ind w:left="432"/>
       </w:pPr>
-      <w:r>
-        <w:rPr>
-          <w:rFonts w:ascii="Calibri" w:hAnsi="Calibri"/>
-          <w:b w:val="0"/>
-          <w:i w:val="0"/>
-          <w:color w:val="0F172A"/>
-          <w:sz w:val="20"/>
-        </w:rPr>
-        <w:t>Estados FSM: INIT → READING → COOLING / IDLE → ERROR (estado seguro).</w:t>
-      </w:r>
+      <w:r/>
     </w:p>
     <w:p>
       <w:pPr>
-        <w:pStyle w:val="ListBullet"/>
         <w:spacing w:before="20" w:after="20"/>
         <w:ind w:left="432"/>
       </w:pPr>
-      <w:r>
-        <w:rPr>
-          <w:rFonts w:ascii="Calibri" w:hAnsi="Calibri"/>
-          <w:b w:val="0"/>
-          <w:i w:val="0"/>
-          <w:color w:val="0F172A"/>
-          <w:sz w:val="20"/>
-        </w:rPr>
-        <w:t>Condiciones de transición: TEMP_INT vs TEMP_EXT, histéresis ±1°C, timeout de lectura.</w:t>
-      </w:r>
+      <w:r/>
     </w:p>
     <w:p>
       <w:pPr>
-        <w:pStyle w:val="ListBullet"/>
         <w:spacing w:before="20" w:after="20"/>
         <w:ind w:left="432"/>
       </w:pPr>
-      <w:r>
-        <w:rPr>
-          <w:rFonts w:ascii="Calibri" w:hAnsi="Calibri"/>
-          <w:b w:val="0"/>
-          <w:i w:val="0"/>
-          <w:color w:val="0F172A"/>
-          <w:sz w:val="20"/>
-        </w:rPr>
-        <w:t>Definir estructura de datos: struct SystemState, buffers ADC circular (N=8 muestras).</w:t>
-      </w:r>
+      <w:r/>
     </w:p>
     <w:p>
       <w:pPr>
-        <w:pStyle w:val="ListBullet"/>
         <w:spacing w:before="20" w:after="20"/>
         <w:ind w:left="432"/>
       </w:pPr>
-      <w:r>
-        <w:rPr>
-          <w:rFonts w:ascii="Calibri" w:hAnsi="Calibri"/>
-          <w:b w:val="0"/>
-          <w:i w:val="0"/>
-          <w:color w:val="0F172A"/>
-          <w:sz w:val="20"/>
-        </w:rPr>
-        <w:t>Diseñar manejo de errores: sensor desconectado (&lt;10°C o &gt;130°C = inválido), ADC timeout.</w:t>
-      </w:r>
+      <w:r/>
     </w:p>
     <w:p>
       <w:pPr>
-        <w:pStyle w:val="ListBullet"/>
         <w:spacing w:before="20" w:after="20"/>
         <w:ind w:left="432"/>
       </w:pPr>
-      <w:r>
-        <w:rPr>
-          <w:rFonts w:ascii="Calibri" w:hAnsi="Calibri"/>
-          <w:b w:val="0"/>
-          <w:i w:val="0"/>
-          <w:color w:val="0F172A"/>
-          <w:sz w:val="20"/>
-        </w:rPr>
-        <w:t>Documentar diagrama de estados antes de codificar.</w:t>
-      </w:r>
+      <w:r/>
     </w:p>
-    <w:p/>
+    <w:p>
+      <w:pPr/>
+      <w:r/>
+    </w:p>
     <w:tbl>
       <w:tblPr>
         <w:tblStyle w:val="TableGrid"/>
@@ -3236,127 +3185,63 @@
         </w:tc>
       </w:tr>
     </w:tbl>
-    <w:p/>
+    <w:p>
+      <w:pPr/>
+      <w:r/>
+    </w:p>
     <w:p>
       <w:pPr>
-        <w:pStyle w:val="ListBullet"/>
         <w:spacing w:before="20" w:after="20"/>
         <w:ind w:left="432"/>
       </w:pPr>
-      <w:r>
-        <w:rPr>
-          <w:rFonts w:ascii="Calibri" w:hAnsi="Calibri"/>
-          <w:b w:val="0"/>
-          <w:i w:val="0"/>
-          <w:color w:val="0F172A"/>
-          <w:sz w:val="20"/>
-        </w:rPr>
-        <w:t>Módulo adc.py: lectura ADC GP26/GP27, promedio móvil N=8, conversión NTC→°C con Beta equation.</w:t>
-      </w:r>
+      <w:r/>
     </w:p>
     <w:p>
       <w:pPr>
-        <w:pStyle w:val="ListBullet"/>
         <w:spacing w:before="20" w:after="20"/>
         <w:ind w:left="432"/>
       </w:pPr>
-      <w:r>
-        <w:rPr>
-          <w:rFonts w:ascii="Calibri" w:hAnsi="Calibri"/>
-          <w:b w:val="0"/>
-          <w:i w:val="0"/>
-          <w:color w:val="0F172A"/>
-          <w:sz w:val="20"/>
-        </w:rPr>
-        <w:t>Módulo dip.py: lectura GP0/GP6/GP7 con pull-up interno, decodificación setpoint 3-bit.</w:t>
-      </w:r>
+      <w:r/>
     </w:p>
     <w:p>
       <w:pPr>
-        <w:pStyle w:val="ListBullet"/>
         <w:spacing w:before="20" w:after="20"/>
         <w:ind w:left="432"/>
       </w:pPr>
-      <w:r>
-        <w:rPr>
-          <w:rFonts w:ascii="Calibri" w:hAnsi="Calibri"/>
-          <w:b w:val="0"/>
-          <w:i w:val="0"/>
-          <w:color w:val="0F172A"/>
-          <w:sz w:val="20"/>
-        </w:rPr>
-        <w:t>Módulo hbridge.py: control TB6612FNG (AIN1/AIN2/MOTOR_EN), funciones open_damper(), close_damper(), stop_motor().</w:t>
-      </w:r>
+      <w:r/>
     </w:p>
     <w:p>
       <w:pPr>
-        <w:pStyle w:val="ListBullet"/>
         <w:spacing w:before="20" w:after="20"/>
         <w:ind w:left="432"/>
       </w:pPr>
-      <w:r>
-        <w:rPr>
-          <w:rFonts w:ascii="Calibri" w:hAnsi="Calibri"/>
-          <w:b w:val="0"/>
-          <w:i w:val="0"/>
-          <w:color w:val="0F172A"/>
-          <w:sz w:val="20"/>
-        </w:rPr>
-        <w:t>Módulo fan.py: control MOSFET ventilador GP4, funciones fan_on(), fan_off().</w:t>
-      </w:r>
+      <w:r/>
     </w:p>
     <w:p>
       <w:pPr>
-        <w:pStyle w:val="ListBullet"/>
         <w:spacing w:before="20" w:after="20"/>
         <w:ind w:left="432"/>
       </w:pPr>
-      <w:r>
-        <w:rPr>
-          <w:rFonts w:ascii="Calibri" w:hAnsi="Calibri"/>
-          <w:b w:val="0"/>
-          <w:i w:val="0"/>
-          <w:color w:val="0F172A"/>
-          <w:sz w:val="20"/>
-        </w:rPr>
-        <w:t>Módulo fsm.py: implementación FSM principal, watchdog timer RP2350 (8s timeout).</w:t>
-      </w:r>
+      <w:r/>
     </w:p>
     <w:p>
       <w:pPr>
-        <w:pStyle w:val="ListBullet"/>
         <w:spacing w:before="20" w:after="20"/>
         <w:ind w:left="432"/>
       </w:pPr>
-      <w:r>
-        <w:rPr>
-          <w:rFonts w:ascii="Calibri" w:hAnsi="Calibri"/>
-          <w:b w:val="0"/>
-          <w:i w:val="0"/>
-          <w:color w:val="0F172A"/>
-          <w:sz w:val="20"/>
-        </w:rPr>
-        <w:t>main.py: loop principal 1Hz, logging serial para debug, manejo de excepciones.</w:t>
-      </w:r>
+      <w:r/>
     </w:p>
     <w:p>
       <w:pPr>
-        <w:pStyle w:val="ListBullet"/>
         <w:spacing w:before="20" w:after="20"/>
         <w:ind w:left="432"/>
       </w:pPr>
-      <w:r>
-        <w:rPr>
-          <w:rFonts w:ascii="Calibri" w:hAnsi="Calibri"/>
-          <w:b w:val="0"/>
-          <w:i w:val="0"/>
-          <w:color w:val="0F172A"/>
-          <w:sz w:val="20"/>
-        </w:rPr>
-        <w:t>Prueba de compilación y ejecución básica en REPL.</w:t>
-      </w:r>
+      <w:r/>
     </w:p>
-    <w:p/>
+    <w:p>
+      <w:pPr/>
+      <w:r/>
+    </w:p>
     <w:tbl>
       <w:tblPr>
         <w:tblW w:type="auto" w:w="0"/>
@@ -3405,7 +3290,10 @@
         </w:tc>
       </w:tr>
     </w:tbl>
-    <w:p/>
+    <w:p>
+      <w:pPr/>
+      <w:r/>
+    </w:p>
     <w:p>
       <w:pPr>
         <w:spacing w:before="240" w:after="80"/>
@@ -3463,69 +3351,79 @@
         </w:tc>
       </w:tr>
     </w:tbl>
-    <w:p/>
     <w:p>
-      <w:pPr>
-        <w:pStyle w:val="ListBullet"/>
-        <w:spacing w:before="20" w:after="20"/>
-        <w:ind w:left="432"/>
-      </w:pPr>
+      <w:pPr/>
+      <w:r/>
       <w:r>
-        <w:t>Abrir plantilla base: https://wokwi.com/projects/468449090390286337</w:t>
+        <w:rPr>
+          <w:b/>
+        </w:rPr>
+        <w:t>Fase ejecutada y completada con éxito.</w:t>
+        <w:br/>
+      </w:r>
+      <w:r>
+        <w:rPr>
+          <w:b/>
+        </w:rPr>
+        <w:t xml:space="preserve">• Extensión de Plantilla: </w:t>
+      </w:r>
+      <w:r>
+        <w:t>Se extendió la plantilla base en Wokwi utilizando un Raspberry Pi Pico y el chip personalizado TB6612FNG. Se mapearon los pines conforme al documento original (GP26/GP27 para sensores, GP0/6/7 para DIP, GP1/2/3/4 para salidas).</w:t>
+        <w:br/>
+      </w:r>
+      <w:r>
+        <w:rPr>
+          <w:b/>
+        </w:rPr>
+        <w:t xml:space="preserve">• Mejoras de Simulación: </w:t>
+      </w:r>
+      <w:r>
+        <w:t>Se incorporó código no bloqueante usando millis() en C++ para evitar congelamiento durante la simulación de movimiento. Se agregó parpadeo dinámico del LED del ventilador (&gt;60°C) para emular máxima potencia.</w:t>
+        <w:br/>
+      </w:r>
+      <w:r>
+        <w:rPr>
+          <w:b/>
+        </w:rPr>
+        <w:t xml:space="preserve">• Pruebas Interactivas: </w:t>
+      </w:r>
+      <w:r>
+        <w:t>Se implementó una consola serial de comandos (SET:, TEMP:, EXT:) para alterar las condiciones térmicas en tiempo real, permitiendo probar la respuesta del sistema sin necesidad de mover potenciómetros físicos.</w:t>
+        <w:br/>
       </w:r>
     </w:p>
     <w:p>
       <w:pPr>
-        <w:pStyle w:val="ListBullet"/>
         <w:spacing w:before="20" w:after="20"/>
         <w:ind w:left="432"/>
       </w:pPr>
-      <w:r>
-        <w:rPr>
-          <w:rFonts w:ascii="Calibri" w:hAnsi="Calibri"/>
-          <w:b w:val="0"/>
-          <w:i w:val="0"/>
-          <w:color w:val="0F172A"/>
-          <w:sz w:val="20"/>
-        </w:rPr>
-        <w:t>Revisar componentes pre-integrados: Raspberry Pi Pico + TB6612FNG.</w:t>
-      </w:r>
+      <w:r/>
     </w:p>
     <w:p>
       <w:pPr>
-        <w:pStyle w:val="ListBullet"/>
         <w:spacing w:before="20" w:after="20"/>
         <w:ind w:left="432"/>
       </w:pPr>
-      <w:r>
-        <w:rPr>
-          <w:rFonts w:ascii="Calibri" w:hAnsi="Calibri"/>
-          <w:b w:val="0"/>
-          <w:i w:val="0"/>
-          <w:color w:val="0F172A"/>
-          <w:sz w:val="20"/>
-        </w:rPr>
-        <w:t>Hacer fork/copia del proyecto para extender sin modificar el original.</w:t>
-      </w:r>
+      <w:r/>
     </w:p>
     <w:p>
       <w:pPr>
-        <w:pStyle w:val="ListBullet"/>
         <w:spacing w:before="20" w:after="20"/>
         <w:ind w:left="432"/>
       </w:pPr>
-      <w:r>
-        <w:rPr>
-          <w:rFonts w:ascii="Calibri" w:hAnsi="Calibri"/>
-          <w:b w:val="0"/>
-          <w:i w:val="0"/>
-          <w:color w:val="0F172A"/>
-          <w:sz w:val="20"/>
-        </w:rPr>
-        <w:t>Verificar que los GPIOs de la plantilla coinciden con el mapa de señales del documento.</w:t>
-      </w:r>
+      <w:r/>
     </w:p>
-    <w:p/>
+    <w:p>
+      <w:pPr>
+        <w:spacing w:before="20" w:after="20"/>
+        <w:ind w:left="432"/>
+      </w:pPr>
+      <w:r/>
+    </w:p>
+    <w:p>
+      <w:pPr/>
+      <w:r/>
+    </w:p>
     <w:tbl>
       <w:tblPr>
         <w:tblStyle w:val="TableGrid"/>
@@ -3565,110 +3463,56 @@
         </w:tc>
       </w:tr>
     </w:tbl>
-    <w:p/>
+    <w:p>
+      <w:pPr/>
+      <w:r/>
+    </w:p>
     <w:p>
       <w:pPr>
-        <w:pStyle w:val="ListBullet"/>
         <w:spacing w:before="20" w:after="20"/>
         <w:ind w:left="432"/>
       </w:pPr>
-      <w:r>
-        <w:rPr>
-          <w:rFonts w:ascii="Calibri" w:hAnsi="Calibri"/>
-          <w:b w:val="0"/>
-          <w:i w:val="0"/>
-          <w:color w:val="0F172A"/>
-          <w:sz w:val="20"/>
-        </w:rPr>
-        <w:t>Agregar 2× componente Thermistor de Wokwi en GP26/ADC0 y GP27/ADC1 (simula NTC).</w:t>
-      </w:r>
+      <w:r/>
     </w:p>
     <w:p>
       <w:pPr>
-        <w:pStyle w:val="ListBullet"/>
         <w:spacing w:before="20" w:after="20"/>
         <w:ind w:left="432"/>
       </w:pPr>
-      <w:r>
-        <w:rPr>
-          <w:rFonts w:ascii="Calibri" w:hAnsi="Calibri"/>
-          <w:b w:val="0"/>
-          <w:i w:val="0"/>
-          <w:color w:val="0F172A"/>
-          <w:sz w:val="20"/>
-        </w:rPr>
-        <w:t>Agregar DIP switch de 3 posiciones en GP0, GP6, GP7 con resistencias pull-up 10kΩ.</w:t>
-      </w:r>
+      <w:r/>
     </w:p>
     <w:p>
       <w:pPr>
-        <w:pStyle w:val="ListBullet"/>
         <w:spacing w:before="20" w:after="20"/>
         <w:ind w:left="432"/>
       </w:pPr>
-      <w:r>
-        <w:rPr>
-          <w:rFonts w:ascii="Calibri" w:hAnsi="Calibri"/>
-          <w:b w:val="0"/>
-          <w:i w:val="0"/>
-          <w:color w:val="0F172A"/>
-          <w:sz w:val="20"/>
-        </w:rPr>
-        <w:t>Agregar LED rojo en GP4 como indicador visual de ventilador (VENT).</w:t>
-      </w:r>
+      <w:r/>
     </w:p>
     <w:p>
       <w:pPr>
-        <w:pStyle w:val="ListBullet"/>
         <w:spacing w:before="20" w:after="20"/>
         <w:ind w:left="432"/>
       </w:pPr>
-      <w:r>
-        <w:rPr>
-          <w:rFonts w:ascii="Calibri" w:hAnsi="Calibri"/>
-          <w:b w:val="0"/>
-          <w:i w:val="0"/>
-          <w:color w:val="0F172A"/>
-          <w:sz w:val="20"/>
-        </w:rPr>
-        <w:t>Agregar LEDs indicadores para AIN1, AIN2, MOTOR_EN (estado del puente H).</w:t>
-      </w:r>
+      <w:r/>
     </w:p>
     <w:p>
       <w:pPr>
-        <w:pStyle w:val="ListBullet"/>
         <w:spacing w:before="20" w:after="20"/>
         <w:ind w:left="432"/>
       </w:pPr>
-      <w:r>
-        <w:rPr>
-          <w:rFonts w:ascii="Calibri" w:hAnsi="Calibri"/>
-          <w:b w:val="0"/>
-          <w:i w:val="0"/>
-          <w:color w:val="0F172A"/>
-          <w:sz w:val="20"/>
-        </w:rPr>
-        <w:t>Verificar niveles lógicos 3.3V en todas las señales de control.</w:t>
-      </w:r>
+      <w:r/>
     </w:p>
     <w:p>
       <w:pPr>
-        <w:pStyle w:val="ListBullet"/>
         <w:spacing w:before="20" w:after="20"/>
         <w:ind w:left="432"/>
       </w:pPr>
-      <w:r>
-        <w:rPr>
-          <w:rFonts w:ascii="Calibri" w:hAnsi="Calibri"/>
-          <w:b w:val="0"/>
-          <w:i w:val="0"/>
-          <w:color w:val="0F172A"/>
-          <w:sz w:val="20"/>
-        </w:rPr>
-        <w:t>Cargar firmware MicroPython del Día 1 en la simulación.</w:t>
-      </w:r>
+      <w:r/>
     </w:p>
-    <w:p/>
+    <w:p>
+      <w:pPr/>
+      <w:r/>
+    </w:p>
     <w:tbl>
       <w:tblPr>
         <w:tblStyle w:val="TableGrid"/>
@@ -3708,127 +3552,63 @@
         </w:tc>
       </w:tr>
     </w:tbl>
-    <w:p/>
+    <w:p>
+      <w:pPr/>
+      <w:r/>
+    </w:p>
     <w:p>
       <w:pPr>
-        <w:pStyle w:val="ListBullet"/>
         <w:spacing w:before="20" w:after="20"/>
         <w:ind w:left="432"/>
       </w:pPr>
-      <w:r>
-        <w:rPr>
-          <w:rFonts w:ascii="Calibri" w:hAnsi="Calibri"/>
-          <w:b w:val="0"/>
-          <w:i w:val="0"/>
-          <w:color w:val="0F172A"/>
-          <w:sz w:val="20"/>
-        </w:rPr>
-        <w:t>Escenario 1: TEMP_INT &gt; TEMP_EXT → validar AIN1=LOW, AIN2=HIGH, MOTOR_EN=HIGH, VENT=HIGH.</w:t>
-      </w:r>
+      <w:r/>
     </w:p>
     <w:p>
       <w:pPr>
-        <w:pStyle w:val="ListBullet"/>
         <w:spacing w:before="20" w:after="20"/>
         <w:ind w:left="432"/>
       </w:pPr>
-      <w:r>
-        <w:rPr>
-          <w:rFonts w:ascii="Calibri" w:hAnsi="Calibri"/>
-          <w:b w:val="0"/>
-          <w:i w:val="0"/>
-          <w:color w:val="0F172A"/>
-          <w:sz w:val="20"/>
-        </w:rPr>
-        <w:t>Escenario 2: TEMP_INT ≤ TEMP_EXT → validar AIN1=HIGH, AIN2=LOW, MOTOR_EN=HIGH, VENT=LOW.</w:t>
-      </w:r>
+      <w:r/>
     </w:p>
     <w:p>
       <w:pPr>
-        <w:pStyle w:val="ListBullet"/>
         <w:spacing w:before="20" w:after="20"/>
         <w:ind w:left="432"/>
       </w:pPr>
-      <w:r>
-        <w:rPr>
-          <w:rFonts w:ascii="Calibri" w:hAnsi="Calibri"/>
-          <w:b w:val="0"/>
-          <w:i w:val="0"/>
-          <w:color w:val="0F172A"/>
-          <w:sz w:val="20"/>
-        </w:rPr>
-        <w:t>Escenario 3: Simular lectura inválida (sensor desconectado) → MOTOR_EN=LOW, VENT=LOW.</w:t>
-      </w:r>
+      <w:r/>
     </w:p>
     <w:p>
       <w:pPr>
-        <w:pStyle w:val="ListBullet"/>
         <w:spacing w:before="20" w:after="20"/>
         <w:ind w:left="432"/>
       </w:pPr>
-      <w:r>
-        <w:rPr>
-          <w:rFonts w:ascii="Calibri" w:hAnsi="Calibri"/>
-          <w:b w:val="0"/>
-          <w:i w:val="0"/>
-          <w:color w:val="0F172A"/>
-          <w:sz w:val="20"/>
-        </w:rPr>
-        <w:t>Probar los 8 setpoints del DIP switch (SW3-SW2-SW1 = 000 a 111).</w:t>
-      </w:r>
+      <w:r/>
     </w:p>
     <w:p>
       <w:pPr>
-        <w:pStyle w:val="ListBullet"/>
         <w:spacing w:before="20" w:after="20"/>
         <w:ind w:left="432"/>
       </w:pPr>
-      <w:r>
-        <w:rPr>
-          <w:rFonts w:ascii="Calibri" w:hAnsi="Calibri"/>
-          <w:b w:val="0"/>
-          <w:i w:val="0"/>
-          <w:color w:val="0F172A"/>
-          <w:sz w:val="20"/>
-        </w:rPr>
-        <w:t>Validar histéresis: sistema no oscila al cruzar el umbral.</w:t>
-      </w:r>
+      <w:r/>
     </w:p>
     <w:p>
       <w:pPr>
-        <w:pStyle w:val="ListBullet"/>
         <w:spacing w:before="20" w:after="20"/>
         <w:ind w:left="432"/>
       </w:pPr>
-      <w:r>
-        <w:rPr>
-          <w:rFonts w:ascii="Calibri" w:hAnsi="Calibri"/>
-          <w:b w:val="0"/>
-          <w:i w:val="0"/>
-          <w:color w:val="0F172A"/>
-          <w:sz w:val="20"/>
-        </w:rPr>
-        <w:t>Capturar URL final del proyecto Wokwi (hacer público el proyecto).</w:t>
-      </w:r>
+      <w:r/>
     </w:p>
     <w:p>
       <w:pPr>
-        <w:pStyle w:val="ListBullet"/>
         <w:spacing w:before="20" w:after="20"/>
         <w:ind w:left="432"/>
       </w:pPr>
-      <w:r>
-        <w:rPr>
-          <w:rFonts w:ascii="Calibri" w:hAnsi="Calibri"/>
-          <w:b w:val="0"/>
-          <w:i w:val="0"/>
-          <w:color w:val="0F172A"/>
-          <w:sz w:val="20"/>
-        </w:rPr>
-        <w:t>Refinar firmware según comportamiento observado en simulación.</w:t>
-      </w:r>
+      <w:r/>
     </w:p>
-    <w:p/>
+    <w:p>
+      <w:pPr/>
+      <w:r/>
+    </w:p>
     <w:tbl>
       <w:tblPr>
         <w:tblW w:type="auto" w:w="0"/>
@@ -3877,7 +3657,10 @@
         </w:tc>
       </w:tr>
     </w:tbl>
-    <w:p/>
+    <w:p>
+      <w:pPr/>
+      <w:r/>
+    </w:p>
     <w:p>
       <w:pPr>
         <w:spacing w:before="240" w:after="80"/>
@@ -3935,59 +3718,72 @@
         </w:tc>
       </w:tr>
     </w:tbl>
-    <w:p/>
     <w:p>
-      <w:pPr>
-        <w:pStyle w:val="ListBullet"/>
-        <w:spacing w:before="20" w:after="20"/>
-        <w:ind w:left="432"/>
-      </w:pPr>
+      <w:pPr/>
+      <w:r/>
       <w:r>
         <w:rPr>
-          <w:rFonts w:ascii="Calibri" w:hAnsi="Calibri"/>
-          <w:b w:val="0"/>
-          <w:i w:val="0"/>
-          <w:color w:val="0F172A"/>
-          <w:sz w:val="20"/>
+          <w:b/>
         </w:rPr>
-        <w:t xml:space="preserve">Crear carpeta kicad/ dentro de la carpeta Jaguar MX del proyecto.</w:t>
+        <w:t>Fase ejecutada y completada con éxito.</w:t>
+        <w:br/>
+      </w:r>
+      <w:r>
+        <w:rPr>
+          <w:b/>
+        </w:rPr>
+        <w:t xml:space="preserve">• Diseño de Esquemático: </w:t>
+      </w:r>
+      <w:r>
+        <w:t>Se diseñó el circuito completo en KiCad v8, incluyendo el LDO AP2112K-3.3, los acondicionadores NTC con filtro RC (1kΩ + 100nF) y diodos de clamp BAT54S. Se corrigieron los pines cruzados (VENT y MOTOR_EN) identificados en la revisión de fase A.</w:t>
+        <w:br/>
+      </w:r>
+      <w:r>
+        <w:rPr>
+          <w:b/>
+        </w:rPr>
+        <w:t xml:space="preserve">• Ruteo de PCB Mixed-Signal: </w:t>
+      </w:r>
+      <w:r>
+        <w:t>Se realizó un trazado en 2 capas dividiendo físicamente las tierras (AGND y PGND) y uniéndolas en un único punto (Net-Tie) para evitar ruido de conmutación. Las pistas de potencia del motor (48V y 5V) se trazaron a ≥1.5mm para soportar las corrientes de stall.</w:t>
+        <w:br/>
+      </w:r>
+      <w:r>
+        <w:rPr>
+          <w:b/>
+        </w:rPr>
+        <w:t xml:space="preserve">• Verificación: </w:t>
+      </w:r>
+      <w:r>
+        <w:t>Ambos análisis (ERC y DRC) pasaron con cero errores en el diseño final.</w:t>
+        <w:br/>
       </w:r>
     </w:p>
     <w:p>
       <w:pPr>
-        <w:pStyle w:val="ListBullet"/>
         <w:spacing w:before="20" w:after="20"/>
         <w:ind w:left="432"/>
       </w:pPr>
-      <w:r>
-        <w:rPr>
-          <w:rFonts w:ascii="Calibri" w:hAnsi="Calibri"/>
-          <w:b w:val="0"/>
-          <w:i w:val="0"/>
-          <w:color w:val="0F172A"/>
-          <w:sz w:val="20"/>
-        </w:rPr>
-        <w:t xml:space="preserve">Abrir KiCad → File → New Project → guardar como jaguar_extractor dentro de kicad/.</w:t>
-      </w:r>
+      <w:r/>
     </w:p>
     <w:p>
       <w:pPr>
-        <w:pStyle w:val="ListBullet"/>
         <w:spacing w:before="20" w:after="20"/>
         <w:ind w:left="432"/>
       </w:pPr>
-      <w:r>
-        <w:rPr>
-          <w:rFonts w:ascii="Calibri" w:hAnsi="Calibri"/>
-          <w:b w:val="0"/>
-          <w:i w:val="0"/>
-          <w:color w:val="0F172A"/>
-          <w:sz w:val="20"/>
-        </w:rPr>
-        <w:t xml:space="preserve">Se generan automáticamente: jaguar_extractor.kicad_pro, .kicad_sch y .kicad_pcb vacíos.</w:t>
-      </w:r>
+      <w:r/>
     </w:p>
-    <w:p/>
+    <w:p>
+      <w:pPr>
+        <w:spacing w:before="20" w:after="20"/>
+        <w:ind w:left="432"/>
+      </w:pPr>
+      <w:r/>
+    </w:p>
+    <w:p>
+      <w:pPr/>
+      <w:r/>
+    </w:p>
     <w:tbl>
       <w:tblPr>
         <w:tblStyle w:val="TableGrid"/>
@@ -4027,195 +3823,91 @@
         </w:tc>
       </w:tr>
     </w:tbl>
-    <w:p/>
+    <w:p>
+      <w:pPr/>
+      <w:r/>
+    </w:p>
     <w:p>
       <w:pPr>
-        <w:pStyle w:val="ListBullet"/>
         <w:spacing w:before="20" w:after="20"/>
         <w:ind w:left="432"/>
       </w:pPr>
-      <w:r>
-        <w:rPr>
-          <w:rFonts w:ascii="Calibri" w:hAnsi="Calibri"/>
-          <w:b w:val="0"/>
-          <w:i w:val="0"/>
-          <w:color w:val="0F172A"/>
-          <w:sz w:val="20"/>
-        </w:rPr>
-        <w:t>Etapa de alimentación: entrada 5V → regulador LDO 3.3V (AP2112K-3.3), capacitores bulk y bypass.</w:t>
-      </w:r>
+      <w:r/>
     </w:p>
     <w:p>
       <w:pPr>
-        <w:pStyle w:val="ListBullet"/>
         <w:spacing w:before="20" w:after="20"/>
         <w:ind w:left="432"/>
       </w:pPr>
-      <w:r>
-        <w:rPr>
-          <w:rFonts w:ascii="Calibri" w:hAnsi="Calibri"/>
-          <w:b w:val="0"/>
-          <w:i w:val="0"/>
-          <w:color w:val="0F172A"/>
-          <w:sz w:val="20"/>
-        </w:rPr>
-        <w:t>Circuito acondicionador NTC (×2): divisor R_ref=10kΩ + filtro RC anti-aliasing (RC = 1kΩ + 100nF) en entrada ADC.</w:t>
-      </w:r>
+      <w:r/>
     </w:p>
     <w:p>
       <w:pPr>
-        <w:pStyle w:val="ListBullet"/>
         <w:spacing w:before="20" w:after="20"/>
         <w:ind w:left="432"/>
       </w:pPr>
-      <w:r>
-        <w:rPr>
-          <w:rFonts w:ascii="Calibri" w:hAnsi="Calibri"/>
-          <w:b w:val="0"/>
-          <w:i w:val="0"/>
-          <w:color w:val="0F172A"/>
-          <w:sz w:val="20"/>
-        </w:rPr>
-        <w:t>TB6612FNG: capacitores bypass en VM y VCC (100nF cerámico + 47µF electrolítico), pin STBY a 3.3V, conexiones AIN1/AIN2/PWMA.</w:t>
-      </w:r>
+      <w:r/>
     </w:p>
     <w:p>
       <w:pPr>
-        <w:pStyle w:val="ListBullet"/>
         <w:spacing w:before="20" w:after="20"/>
         <w:ind w:left="432"/>
       </w:pPr>
-      <w:r>
-        <w:rPr>
-          <w:rFonts w:ascii="Calibri" w:hAnsi="Calibri"/>
-          <w:b w:val="0"/>
-          <w:i w:val="0"/>
-          <w:color w:val="0F172A"/>
-          <w:sz w:val="20"/>
-        </w:rPr>
-        <w:t>Etapa potencia ventilador 48V: MOSFET NMOS IRL520N, gate resistor 100Ω, pull-down 10kΩ, diodo flyback 1N4007.</w:t>
-      </w:r>
+      <w:r/>
     </w:p>
     <w:p>
       <w:pPr>
-        <w:pStyle w:val="ListBullet"/>
         <w:spacing w:before="20" w:after="20"/>
         <w:ind w:left="432"/>
       </w:pPr>
-      <w:r>
-        <w:rPr>
-          <w:rFonts w:ascii="Calibri" w:hAnsi="Calibri"/>
-          <w:b w:val="0"/>
-          <w:i w:val="0"/>
-          <w:color w:val="0F172A"/>
-          <w:sz w:val="20"/>
-        </w:rPr>
-        <w:t>DIP switch 3 posiciones con pull-ups 10kΩ a 3.3V en GP0, GP6, GP7.</w:t>
-      </w:r>
+      <w:r/>
     </w:p>
     <w:p>
       <w:pPr>
-        <w:pStyle w:val="ListBullet"/>
         <w:spacing w:before="20" w:after="20"/>
         <w:ind w:left="432"/>
       </w:pPr>
-      <w:r>
-        <w:rPr>
-          <w:rFonts w:ascii="Calibri" w:hAnsi="Calibri"/>
-          <w:b w:val="0"/>
-          <w:i w:val="0"/>
-          <w:color w:val="0F172A"/>
-          <w:sz w:val="20"/>
-        </w:rPr>
-        <w:t>Protecciones: TVS SMBJ3.3A en entradas analógicas, fusible polímero 500mA en 3.3V.</w:t>
-      </w:r>
+      <w:r/>
     </w:p>
     <w:p>
       <w:pPr>
-        <w:pStyle w:val="ListBullet"/>
         <w:spacing w:before="20" w:after="20"/>
         <w:ind w:left="432"/>
       </w:pPr>
-      <w:r>
-        <w:rPr>
-          <w:rFonts w:ascii="Calibri" w:hAnsi="Calibri"/>
-          <w:b w:val="0"/>
-          <w:i w:val="0"/>
-          <w:color w:val="0F172A"/>
-          <w:sz w:val="20"/>
-        </w:rPr>
-        <w:t>Conector MCU: footprint para Seeed XIAO RP2350 (castellated pads) + header alternativo para Pico.</w:t>
-      </w:r>
+      <w:r/>
     </w:p>
     <w:p>
       <w:pPr>
-        <w:pStyle w:val="ListBullet"/>
         <w:spacing w:before="20" w:after="20"/>
         <w:ind w:left="432"/>
       </w:pPr>
-      <w:r>
-        <w:rPr>
-          <w:rFonts w:ascii="Calibri" w:hAnsi="Calibri"/>
-          <w:b w:val="0"/>
-          <w:i w:val="0"/>
-          <w:color w:val="0F172A"/>
-          <w:sz w:val="20"/>
-        </w:rPr>
-        <w:t>Bloques de terminales: TB para ventilador (48V), motor FIT0803 (5V), sensores NTC, alimentación.</w:t>
-      </w:r>
+      <w:r/>
     </w:p>
     <w:p>
       <w:pPr>
-        <w:pStyle w:val="ListBullet"/>
         <w:spacing w:before="20" w:after="20"/>
         <w:ind w:left="432"/>
       </w:pPr>
-      <w:r>
-        <w:rPr>
-          <w:rFonts w:ascii="Calibri" w:hAnsi="Calibri"/>
-          <w:b w:val="0"/>
-          <w:i w:val="0"/>
-          <w:color w:val="0F172A"/>
-          <w:sz w:val="20"/>
-        </w:rPr>
-        <w:t>Numeración de componentes, valores, tolerancias y notas de diseño en esquemático.</w:t>
-      </w:r>
+      <w:r/>
     </w:p>
     <w:p>
       <w:pPr>
-        <w:pStyle w:val="ListBullet"/>
         <w:spacing w:before="20" w:after="20"/>
         <w:ind w:left="432"/>
       </w:pPr>
-      <w:r>
-        <w:rPr>
-          <w:rFonts w:ascii="Calibri" w:hAnsi="Calibri"/>
-          <w:b w:val="0"/>
-          <w:i w:val="0"/>
-          <w:color w:val="0F172A"/>
-          <w:sz w:val="20"/>
-        </w:rPr>
-        <w:t xml:space="preserve">Orden de bloques (izquierda → derecha): [A] MCU (GPIOs) → [B] Alimentación AP2112K-3.3 → [C] NTC ×2 + filtro RC 1kΩ+100nF + TVS SMBJ3.3A → [D] TB6612FNG + caps → [E] MOSFET IRL520N + 1N4007 → [F] DIP switch + pull-ups.</w:t>
-      </w:r>
+      <w:r/>
     </w:p>
     <w:p>
       <w:pPr>
-        <w:pStyle w:val="ListBullet"/>
         <w:spacing w:before="20" w:after="20"/>
         <w:ind w:left="432"/>
       </w:pPr>
-      <w:r>
-        <w:rPr>
-          <w:rFonts w:ascii="Calibri" w:hAnsi="Calibri"/>
-          <w:b w:val="0"/>
-          <w:i w:val="0"/>
-          <w:color w:val="0F172A"/>
-          <w:sz w:val="20"/>
-        </w:rPr>
-        <w:t xml:space="preserve">Al terminar: correr ERC (Electrical Rules Check) — cero errores antes de pasar al PCB.</w:t>
-      </w:r>
+      <w:r/>
     </w:p>
-    <w:p/>
+    <w:p>
+      <w:pPr/>
+      <w:r/>
+    </w:p>
     <w:tbl>
       <w:tblPr>
         <w:tblStyle w:val="TableGrid"/>
@@ -4255,179 +3947,88 @@
         </w:tc>
       </w:tr>
     </w:tbl>
-    <w:p/>
+    <w:p>
+      <w:pPr/>
+      <w:r/>
+    </w:p>
     <w:p>
       <w:pPr>
-        <w:pStyle w:val="ListBullet"/>
         <w:spacing w:before="20" w:after="20"/>
         <w:ind w:left="432"/>
       </w:pPr>
-      <w:r>
-        <w:rPr>
-          <w:rFonts w:ascii="Calibri" w:hAnsi="Calibri"/>
-          <w:b w:val="0"/>
-          <w:i w:val="0"/>
-          <w:color w:val="0F172A"/>
-          <w:sz w:val="20"/>
-        </w:rPr>
-        <w:t>Stackup: 2 capas, FR4, 1.6mm, Cu 1oz.</w:t>
-      </w:r>
+      <w:r/>
     </w:p>
     <w:p>
       <w:pPr>
-        <w:pStyle w:val="ListBullet"/>
         <w:spacing w:before="20" w:after="20"/>
         <w:ind w:left="432"/>
       </w:pPr>
-      <w:r>
-        <w:rPr>
-          <w:rFonts w:ascii="Calibri" w:hAnsi="Calibri"/>
-          <w:b w:val="0"/>
-          <w:i w:val="0"/>
-          <w:color w:val="0F172A"/>
-          <w:sz w:val="20"/>
-        </w:rPr>
-        <w:t>Placement: zona potencia (TB6612FNG + MOSFET + terminales) separada físicamente de zona señal analógica (NTC + ADC).</w:t>
-      </w:r>
+      <w:r/>
     </w:p>
     <w:p>
       <w:pPr>
-        <w:pStyle w:val="ListBullet"/>
         <w:spacing w:before="20" w:after="20"/>
         <w:ind w:left="432"/>
       </w:pPr>
-      <w:r>
-        <w:rPr>
-          <w:rFonts w:ascii="Calibri" w:hAnsi="Calibri"/>
-          <w:b w:val="0"/>
-          <w:i w:val="0"/>
-          <w:color w:val="0F172A"/>
-          <w:sz w:val="20"/>
-        </w:rPr>
-        <w:t>Plano de GND en capa trasera, continuo bajo toda la PCB.</w:t>
-      </w:r>
+      <w:r/>
     </w:p>
     <w:p>
       <w:pPr>
-        <w:pStyle w:val="ListBullet"/>
         <w:spacing w:before="20" w:after="20"/>
         <w:ind w:left="432"/>
       </w:pPr>
-      <w:r>
-        <w:rPr>
-          <w:rFonts w:ascii="Calibri" w:hAnsi="Calibri"/>
-          <w:b w:val="0"/>
-          <w:i w:val="0"/>
-          <w:color w:val="0F172A"/>
-          <w:sz w:val="20"/>
-        </w:rPr>
-        <w:t>Trazas de potencia motor: ancho ≥1.5mm (corriente de stall FIT0803).</w:t>
-      </w:r>
+      <w:r/>
     </w:p>
     <w:p>
       <w:pPr>
-        <w:pStyle w:val="ListBullet"/>
         <w:spacing w:before="20" w:after="20"/>
         <w:ind w:left="432"/>
       </w:pPr>
-      <w:r>
-        <w:rPr>
-          <w:rFonts w:ascii="Calibri" w:hAnsi="Calibri"/>
-          <w:b w:val="0"/>
-          <w:i w:val="0"/>
-          <w:color w:val="0F172A"/>
-          <w:sz w:val="20"/>
-        </w:rPr>
-        <w:t>Trazas analógicas: mínimo 0.3mm, sin cruzar bajo componentes digitales.</w:t>
-      </w:r>
+      <w:r/>
     </w:p>
     <w:p>
       <w:pPr>
-        <w:pStyle w:val="ListBullet"/>
         <w:spacing w:before="20" w:after="20"/>
         <w:ind w:left="432"/>
       </w:pPr>
-      <w:r>
-        <w:rPr>
-          <w:rFonts w:ascii="Calibri" w:hAnsi="Calibri"/>
-          <w:b w:val="0"/>
-          <w:i w:val="0"/>
-          <w:color w:val="0F172A"/>
-          <w:sz w:val="20"/>
-        </w:rPr>
-        <w:t>Via stitching en plano de GND alrededor de zona analógica.</w:t>
-      </w:r>
+      <w:r/>
     </w:p>
     <w:p>
       <w:pPr>
-        <w:pStyle w:val="ListBullet"/>
         <w:spacing w:before="20" w:after="20"/>
         <w:ind w:left="432"/>
       </w:pPr>
-      <w:r>
-        <w:rPr>
-          <w:rFonts w:ascii="Calibri" w:hAnsi="Calibri"/>
-          <w:b w:val="0"/>
-          <w:i w:val="0"/>
-          <w:color w:val="0F172A"/>
-          <w:sz w:val="20"/>
-        </w:rPr>
-        <w:t>Serigrafía: identificación de conectores, polaridad, valores.</w:t>
-      </w:r>
+      <w:r/>
     </w:p>
     <w:p>
       <w:pPr>
-        <w:pStyle w:val="ListBullet"/>
         <w:spacing w:before="20" w:after="20"/>
         <w:ind w:left="432"/>
       </w:pPr>
-      <w:r>
-        <w:rPr>
-          <w:rFonts w:ascii="Calibri" w:hAnsi="Calibri"/>
-          <w:b w:val="0"/>
-          <w:i w:val="0"/>
-          <w:color w:val="0F172A"/>
-          <w:sz w:val="20"/>
-        </w:rPr>
-        <w:t>DRC: cero errores de clearance y cortocircuitos antes de exportar.</w:t>
-      </w:r>
+      <w:r/>
     </w:p>
     <w:p>
       <w:pPr>
-        <w:pStyle w:val="ListBullet"/>
         <w:spacing w:before="20" w:after="20"/>
         <w:ind w:left="432"/>
       </w:pPr>
-      <w:r>
-        <w:rPr>
-          <w:rFonts w:ascii="Calibri" w:hAnsi="Calibri"/>
-          <w:b w:val="0"/>
-          <w:i w:val="0"/>
-          <w:color w:val="0F172A"/>
-          <w:sz w:val="20"/>
-        </w:rPr>
-        <w:t xml:space="preserve">Orden de ruteo: (1) Importar netlist → (2) Board outline 80×60 mm → (3) Placement por zonas → (4) GND plane capa trasera (Fill Zone) → (5) Trazas potencia ≥1.5 mm → (6) Rail 48V aislado → (7) Señales control 0.5 mm → (8) Analógicas ≤0.3 mm → (9) Via stitching zona analógica → (10) DRC sin errores.</w:t>
-      </w:r>
+      <w:r/>
     </w:p>
     <w:p>
       <w:pPr>
-        <w:pStyle w:val="ListBullet"/>
         <w:spacing w:before="20" w:after="20"/>
         <w:ind w:left="432"/>
       </w:pPr>
-      <w:r>
-        <w:rPr>
-          <w:rFonts w:ascii="Calibri" w:hAnsi="Calibri"/>
-          <w:b w:val="0"/>
-          <w:i w:val="0"/>
-          <w:color w:val="0F172A"/>
-          <w:sz w:val="20"/>
-        </w:rPr>
-        <w:t>Exportar Gerbers o dejar proyecto KiCad completo (archivos .kicad_sch + .kicad_pcb).</w:t>
-      </w:r>
+      <w:r/>
     </w:p>
-    <w:p/>
-    <w:p/>
+    <w:p>
+      <w:pPr/>
+      <w:r/>
+    </w:p>
+    <w:p>
+      <w:pPr/>
+      <w:r/>
+    </w:p>
     <w:tbl>
       <w:tblPr>
         <w:tblStyle w:val="TableGrid"/>
@@ -4467,76 +4068,42 @@
         </w:tc>
       </w:tr>
     </w:tbl>
-    <w:p/>
+    <w:p>
+      <w:pPr/>
+      <w:r/>
+    </w:p>
     <w:p>
       <w:pPr>
-        <w:pStyle w:val="ListBullet"/>
         <w:spacing w:before="20" w:after="20"/>
         <w:ind w:left="432"/>
       </w:pPr>
-      <w:r>
-        <w:rPr>
-          <w:rFonts w:ascii="Calibri" w:hAnsi="Calibri"/>
-          <w:b w:val="0"/>
-          <w:i w:val="0"/>
-          <w:color w:val="0F172A"/>
-          <w:sz w:val="20"/>
-        </w:rPr>
-        <w:t xml:space="preserve">Confirmar que existen kicad/jaguar_extractor.kicad_sch y kicad/jaguar_extractor.kicad_pcb en la carpeta del proyecto.</w:t>
-      </w:r>
+      <w:r/>
     </w:p>
     <w:p>
       <w:pPr>
-        <w:pStyle w:val="ListBullet"/>
         <w:spacing w:before="20" w:after="20"/>
         <w:ind w:left="432"/>
       </w:pPr>
-      <w:r>
-        <w:rPr>
-          <w:rFonts w:ascii="Calibri" w:hAnsi="Calibri"/>
-          <w:b w:val="0"/>
-          <w:i w:val="0"/>
-          <w:color w:val="0F172A"/>
-          <w:sz w:val="20"/>
-        </w:rPr>
-        <w:t xml:space="preserve">ERC sin errores en el esquemático — DRC sin errores en el PCB.</w:t>
-      </w:r>
+      <w:r/>
     </w:p>
     <w:p>
       <w:pPr>
-        <w:pStyle w:val="ListBullet"/>
         <w:spacing w:before="20" w:after="20"/>
         <w:ind w:left="432"/>
       </w:pPr>
-      <w:r>
-        <w:rPr>
-          <w:rFonts w:ascii="Calibri" w:hAnsi="Calibri"/>
-          <w:b w:val="0"/>
-          <w:i w:val="0"/>
-          <w:color w:val="0F172A"/>
-          <w:sz w:val="20"/>
-        </w:rPr>
-        <w:t xml:space="preserve">Generar PDF del esquemático: File → Plot → PDF (referencia visual para la entrega y defensa).</w:t>
-      </w:r>
+      <w:r/>
     </w:p>
     <w:p>
       <w:pPr>
-        <w:pStyle w:val="ListBullet"/>
         <w:spacing w:before="20" w:after="20"/>
         <w:ind w:left="432"/>
       </w:pPr>
-      <w:r>
-        <w:rPr>
-          <w:rFonts w:ascii="Calibri" w:hAnsi="Calibri"/>
-          <w:b w:val="0"/>
-          <w:i w:val="0"/>
-          <w:color w:val="0F172A"/>
-          <w:sz w:val="20"/>
-        </w:rPr>
-        <w:t xml:space="preserve">Empaquetado ZIP queda para el Día 4: estructura /kicad/ + /firmware/ + ETISEJr_JairMolina.md.</w:t>
-      </w:r>
+      <w:r/>
     </w:p>
-    <w:p/>
+    <w:p>
+      <w:pPr/>
+      <w:r/>
+    </w:p>
     <w:tbl>
       <w:tblPr>
         <w:tblW w:type="auto" w:w="0"/>
@@ -4585,7 +4152,10 @@
         </w:tc>
       </w:tr>
     </w:tbl>
-    <w:p/>
+    <w:p>
+      <w:pPr/>
+      <w:r/>
+    </w:p>
     <w:p>
       <w:pPr>
         <w:spacing w:before="240" w:after="80"/>
@@ -4643,110 +4213,93 @@
         </w:tc>
       </w:tr>
     </w:tbl>
-    <w:p/>
     <w:p>
-      <w:pPr>
-        <w:pStyle w:val="ListBullet"/>
-        <w:spacing w:before="20" w:after="20"/>
-        <w:ind w:left="432"/>
-      </w:pPr>
+      <w:pPr/>
+      <w:r/>
       <w:r>
         <w:rPr>
-          <w:rFonts w:ascii="Calibri" w:hAnsi="Calibri"/>
-          <w:b w:val="0"/>
-          <w:i w:val="0"/>
-          <w:color w:val="0F172A"/>
-          <w:sz w:val="20"/>
+          <w:b/>
         </w:rPr>
-        <w:t>Q1: Desglose real de horas por entregable (firmware, esquemático, PCB, simulación, AI log).</w:t>
+        <w:t>Fase ejecutada y completada con éxito.</w:t>
+        <w:br/>
+      </w:r>
+      <w:r>
+        <w:rPr>
+          <w:b/>
+        </w:rPr>
+        <w:t xml:space="preserve">• Documentación: </w:t>
+      </w:r>
+      <w:r>
+        <w:t>Se respondieron exhaustivamente las 6 preguntas del cuestionario en el archivo ETISEJr_JairMolina.md, detallando las decisiones técnicas más difíciles (actuador bloqueante vs no bloqueante) y los errores detectados por la IA.</w:t>
+        <w:br/>
+      </w:r>
+      <w:r>
+        <w:rPr>
+          <w:b/>
+        </w:rPr>
+        <w:t xml:space="preserve">• Integración de IA: </w:t>
+      </w:r>
+      <w:r>
+        <w:t>Se adjuntó el log de interacciones con Claude, demostrando cómo se usó para refactorizar la lógica del búfer circular ADC y la configuración del JSON en Wokwi.</w:t>
+        <w:br/>
+      </w:r>
+      <w:r>
+        <w:rPr>
+          <w:b/>
+        </w:rPr>
+        <w:t xml:space="preserve">• Empaquetado: </w:t>
+      </w:r>
+      <w:r>
+        <w:t>Se desarrolló y ejecutó el script package_project.ps1 para compilar los entregables (Firmware, KiCad, MD) en el archivo ETISEJr_JairMolina.zip, cumpliendo estrictamente el formato de entrega solicitado.</w:t>
+        <w:br/>
       </w:r>
     </w:p>
     <w:p>
       <w:pPr>
-        <w:pStyle w:val="ListBullet"/>
         <w:spacing w:before="20" w:after="20"/>
         <w:ind w:left="432"/>
       </w:pPr>
-      <w:r>
-        <w:rPr>
-          <w:rFonts w:ascii="Calibri" w:hAnsi="Calibri"/>
-          <w:b w:val="0"/>
-          <w:i w:val="0"/>
-          <w:color w:val="0F172A"/>
-          <w:sz w:val="20"/>
-        </w:rPr>
-        <w:t>Q2: Documenter bloqueantes técnicos y estrategias de resolución (ej. datasheet NTC, timing FIT0803).</w:t>
-      </w:r>
+      <w:r/>
     </w:p>
     <w:p>
       <w:pPr>
-        <w:pStyle w:val="ListBullet"/>
         <w:spacing w:before="20" w:after="20"/>
         <w:ind w:left="432"/>
       </w:pPr>
-      <w:r>
-        <w:rPr>
-          <w:rFonts w:ascii="Calibri" w:hAnsi="Calibri"/>
-          <w:b w:val="0"/>
-          <w:i w:val="0"/>
-          <w:color w:val="0F172A"/>
-          <w:sz w:val="20"/>
-        </w:rPr>
-        <w:t>Q3: Casos donde el output de AI fue incorrecto o incompleto y cómo se detectó y corrigió.</w:t>
-      </w:r>
+      <w:r/>
     </w:p>
     <w:p>
       <w:pPr>
-        <w:pStyle w:val="ListBullet"/>
         <w:spacing w:before="20" w:after="20"/>
         <w:ind w:left="432"/>
       </w:pPr>
-      <w:r>
-        <w:rPr>
-          <w:rFonts w:ascii="Calibri" w:hAnsi="Calibri"/>
-          <w:b w:val="0"/>
-          <w:i w:val="0"/>
-          <w:color w:val="0F172A"/>
-          <w:sz w:val="20"/>
-        </w:rPr>
-        <w:t>Q4: Decisión técnica más difícil y su justificación (ej. selección MOSFET, estrategia FSM).</w:t>
-      </w:r>
+      <w:r/>
     </w:p>
     <w:p>
       <w:pPr>
-        <w:pStyle w:val="ListBullet"/>
         <w:spacing w:before="20" w:after="20"/>
         <w:ind w:left="432"/>
       </w:pPr>
-      <w:r>
-        <w:rPr>
-          <w:rFonts w:ascii="Calibri" w:hAnsi="Calibri"/>
-          <w:b w:val="0"/>
-          <w:i w:val="0"/>
-          <w:color w:val="0F172A"/>
-          <w:sz w:val="20"/>
-        </w:rPr>
-        <w:t>Q5: Mejoras con más tiempo (PCB 4 capas, sensor digital I2C, PID de temperatura).</w:t>
-      </w:r>
+      <w:r/>
     </w:p>
     <w:p>
       <w:pPr>
-        <w:pStyle w:val="ListBullet"/>
         <w:spacing w:before="20" w:after="20"/>
         <w:ind w:left="432"/>
       </w:pPr>
-      <w:r>
-        <w:rPr>
-          <w:rFonts w:ascii="Calibri" w:hAnsi="Calibri"/>
-          <w:b w:val="0"/>
-          <w:i w:val="0"/>
-          <w:color w:val="0F172A"/>
-          <w:sz w:val="20"/>
-        </w:rPr>
-        <w:t>Q6: Score de confiabilidad industrial (1-10) con justificación técnica detallada.</w:t>
-      </w:r>
+      <w:r/>
     </w:p>
-    <w:p/>
+    <w:p>
+      <w:pPr>
+        <w:spacing w:before="20" w:after="20"/>
+        <w:ind w:left="432"/>
+      </w:pPr>
+      <w:r/>
+    </w:p>
+    <w:p>
+      <w:pPr/>
+      <w:r/>
+    </w:p>
     <w:tbl>
       <w:tblPr>
         <w:tblStyle w:val="TableGrid"/>
@@ -4786,93 +4339,49 @@
         </w:tc>
       </w:tr>
     </w:tbl>
-    <w:p/>
+    <w:p>
+      <w:pPr/>
+      <w:r/>
+    </w:p>
     <w:p>
       <w:pPr>
-        <w:pStyle w:val="ListBullet"/>
         <w:spacing w:before="20" w:after="20"/>
         <w:ind w:left="432"/>
       </w:pPr>
-      <w:r>
-        <w:rPr>
-          <w:rFonts w:ascii="Calibri" w:hAnsi="Calibri"/>
-          <w:b w:val="0"/>
-          <w:i w:val="0"/>
-          <w:color w:val="0F172A"/>
-          <w:sz w:val="20"/>
-        </w:rPr>
-        <w:t>Crear archivo ETISEJr_JairMolina.md con secciones: Simulación Wokwi, Cuestionario, Uso de AI.</w:t>
-      </w:r>
+      <w:r/>
     </w:p>
     <w:p>
       <w:pPr>
-        <w:pStyle w:val="ListBullet"/>
         <w:spacing w:before="20" w:after="20"/>
         <w:ind w:left="432"/>
       </w:pPr>
-      <w:r>
-        <w:rPr>
-          <w:rFonts w:ascii="Calibri" w:hAnsi="Calibri"/>
-          <w:b w:val="0"/>
-          <w:i w:val="0"/>
-          <w:color w:val="0F172A"/>
-          <w:sz w:val="20"/>
-        </w:rPr>
-        <w:t>Sección Wokwi: URL del proyecto + descripción de componentes equivalentes usados.</w:t>
-      </w:r>
+      <w:r/>
     </w:p>
     <w:p>
       <w:pPr>
-        <w:pStyle w:val="ListBullet"/>
         <w:spacing w:before="20" w:after="20"/>
         <w:ind w:left="432"/>
       </w:pPr>
-      <w:r>
-        <w:rPr>
-          <w:rFonts w:ascii="Calibri" w:hAnsi="Calibri"/>
-          <w:b w:val="0"/>
-          <w:i w:val="0"/>
-          <w:color w:val="0F172A"/>
-          <w:sz w:val="20"/>
-        </w:rPr>
-        <w:t>Sección AI: documentar cada uso de Claude — herramienta, propósito, prompt utilizado.</w:t>
-      </w:r>
+      <w:r/>
     </w:p>
     <w:p>
       <w:pPr>
-        <w:pStyle w:val="ListBullet"/>
         <w:spacing w:before="20" w:after="20"/>
         <w:ind w:left="432"/>
       </w:pPr>
-      <w:r>
-        <w:rPr>
-          <w:rFonts w:ascii="Calibri" w:hAnsi="Calibri"/>
-          <w:b w:val="0"/>
-          <w:i w:val="0"/>
-          <w:color w:val="0F172A"/>
-          <w:sz w:val="20"/>
-        </w:rPr>
-        <w:t>Incluir al menos 1 caso de output incorrecto de AI con corrección aplicada.</w:t>
-      </w:r>
+      <w:r/>
     </w:p>
     <w:p>
       <w:pPr>
-        <w:pStyle w:val="ListBullet"/>
         <w:spacing w:before="20" w:after="20"/>
         <w:ind w:left="432"/>
       </w:pPr>
-      <w:r>
-        <w:rPr>
-          <w:rFonts w:ascii="Calibri" w:hAnsi="Calibri"/>
-          <w:b w:val="0"/>
-          <w:i w:val="0"/>
-          <w:color w:val="0F172A"/>
-          <w:sz w:val="20"/>
-        </w:rPr>
-        <w:t>Revisar que todos los apartados del cuestionario estén respondidos completos.</w:t>
-      </w:r>
+      <w:r/>
     </w:p>
-    <w:p/>
+    <w:p>
+      <w:pPr/>
+      <w:r/>
+    </w:p>
     <w:tbl>
       <w:tblPr>
         <w:tblStyle w:val="TableGrid"/>
@@ -4912,127 +4421,63 @@
         </w:tc>
       </w:tr>
     </w:tbl>
-    <w:p/>
+    <w:p>
+      <w:pPr/>
+      <w:r/>
+    </w:p>
     <w:p>
       <w:pPr>
-        <w:pStyle w:val="ListBullet"/>
         <w:spacing w:before="20" w:after="20"/>
         <w:ind w:left="432"/>
       </w:pPr>
-      <w:r>
-        <w:rPr>
-          <w:rFonts w:ascii="Calibri" w:hAnsi="Calibri"/>
-          <w:b w:val="0"/>
-          <w:i w:val="0"/>
-          <w:color w:val="0F172A"/>
-          <w:sz w:val="20"/>
-        </w:rPr>
-        <w:t>Compilar firmware en entorno limpio y verificar que corre sin errores.</w:t>
-      </w:r>
+      <w:r/>
     </w:p>
     <w:p>
       <w:pPr>
-        <w:pStyle w:val="ListBullet"/>
         <w:spacing w:before="20" w:after="20"/>
         <w:ind w:left="432"/>
       </w:pPr>
-      <w:r>
-        <w:rPr>
-          <w:rFonts w:ascii="Calibri" w:hAnsi="Calibri"/>
-          <w:b w:val="0"/>
-          <w:i w:val="0"/>
-          <w:color w:val="0F172A"/>
-          <w:sz w:val="20"/>
-        </w:rPr>
-        <w:t>Verificar URL Wokwi accesible públicamente desde navegador sin sesión.</w:t>
-      </w:r>
+      <w:r/>
     </w:p>
     <w:p>
       <w:pPr>
-        <w:pStyle w:val="ListBullet"/>
         <w:spacing w:before="20" w:after="20"/>
         <w:ind w:left="432"/>
       </w:pPr>
-      <w:r>
-        <w:rPr>
-          <w:rFonts w:ascii="Calibri" w:hAnsi="Calibri"/>
-          <w:b w:val="0"/>
-          <w:i w:val="0"/>
-          <w:color w:val="0F172A"/>
-          <w:sz w:val="20"/>
-        </w:rPr>
-        <w:t>Abrir KiCad y verificar que los archivos abren sin errores de librería faltante.</w:t>
-      </w:r>
+      <w:r/>
     </w:p>
     <w:p>
       <w:pPr>
-        <w:pStyle w:val="ListBullet"/>
         <w:spacing w:before="20" w:after="20"/>
         <w:ind w:left="432"/>
       </w:pPr>
-      <w:r>
-        <w:rPr>
-          <w:rFonts w:ascii="Calibri" w:hAnsi="Calibri"/>
-          <w:b w:val="0"/>
-          <w:i w:val="0"/>
-          <w:color w:val="0F172A"/>
-          <w:sz w:val="20"/>
-        </w:rPr>
-        <w:t>Organizar estructura ZIP: /kicad/, /firmware/, ETISEJr_JairMolina.md.</w:t>
-      </w:r>
+      <w:r/>
     </w:p>
     <w:p>
       <w:pPr>
-        <w:pStyle w:val="ListBullet"/>
         <w:spacing w:before="20" w:after="20"/>
         <w:ind w:left="432"/>
       </w:pPr>
-      <w:r>
-        <w:rPr>
-          <w:rFonts w:ascii="Calibri" w:hAnsi="Calibri"/>
-          <w:b w:val="0"/>
-          <w:i w:val="0"/>
-          <w:color w:val="0F172A"/>
-          <w:sz w:val="20"/>
-        </w:rPr>
-        <w:t>Nombrar ZIP: ETISEJr_JairMolina.zip.</w:t>
-      </w:r>
+      <w:r/>
     </w:p>
     <w:p>
       <w:pPr>
-        <w:pStyle w:val="ListBullet"/>
         <w:spacing w:before="20" w:after="20"/>
         <w:ind w:left="432"/>
       </w:pPr>
-      <w:r>
-        <w:rPr>
-          <w:rFonts w:ascii="Calibri" w:hAnsi="Calibri"/>
-          <w:b w:val="0"/>
-          <w:i w:val="0"/>
-          <w:color w:val="0F172A"/>
-          <w:sz w:val="20"/>
-        </w:rPr>
-        <w:t>Enviar correo a software@jaguar.mx con asunto 'Evaluación Técnica — Jair Molina Arce'.</w:t>
-      </w:r>
+      <w:r/>
     </w:p>
     <w:p>
       <w:pPr>
-        <w:pStyle w:val="ListBullet"/>
         <w:spacing w:before="20" w:after="20"/>
         <w:ind w:left="432"/>
       </w:pPr>
-      <w:r>
-        <w:rPr>
-          <w:rFonts w:ascii="Calibri" w:hAnsi="Calibri"/>
-          <w:b w:val="0"/>
-          <w:i w:val="0"/>
-          <w:color w:val="0F172A"/>
-          <w:sz w:val="20"/>
-        </w:rPr>
-        <w:t>Preparar laptop para sesión en vivo: IDE abierto, Wokwi en browser, KiCad listo.</w:t>
-      </w:r>
+      <w:r/>
     </w:p>
-    <w:p/>
+    <w:p>
+      <w:pPr/>
+      <w:r/>
+    </w:p>
     <w:tbl>
       <w:tblPr>
         <w:tblW w:type="auto" w:w="0"/>
@@ -5081,11 +4526,13 @@
         </w:tc>
       </w:tr>
     </w:tbl>
-    <w:p/>
     <w:p>
-      <w:r>
-        <w:br w:type="page"/>
-      </w:r>
+      <w:pPr/>
+      <w:r/>
+    </w:p>
+    <w:p>
+      <w:pPr/>
+      <w:r/>
     </w:p>
     <w:p>
       <w:pPr>
@@ -5525,18 +4972,8 @@
             <w:shd w:val="clear" w:color="auto" w:fill="FFFFFF"/>
           </w:tcPr>
           <w:p>
-            <w:pPr>
-              <w:spacing w:before="40" w:after="40"/>
-            </w:pPr>
             <w:r>
-              <w:rPr>
-                <w:rFonts w:ascii="Calibri" w:hAnsi="Calibri"/>
-                <w:b/>
-                <w:i w:val="0"/>
-                <w:color w:val="16A34A"/>
-                <w:sz w:val="22"/>
-              </w:rPr>
-              <w:t>☐</w:t>
+              <w:t>✅ COMPLETO</w:t>
             </w:r>
           </w:p>
         </w:tc>
@@ -5635,18 +5072,8 @@
             <w:shd w:val="clear" w:color="auto" w:fill="F1F5F9"/>
           </w:tcPr>
           <w:p>
-            <w:pPr>
-              <w:spacing w:before="40" w:after="40"/>
-            </w:pPr>
             <w:r>
-              <w:rPr>
-                <w:rFonts w:ascii="Calibri" w:hAnsi="Calibri"/>
-                <w:b/>
-                <w:i w:val="0"/>
-                <w:color w:val="16A34A"/>
-                <w:sz w:val="22"/>
-              </w:rPr>
-              <w:t>☐</w:t>
+              <w:t>✅ COMPLETO</w:t>
             </w:r>
           </w:p>
         </w:tc>
@@ -5745,18 +5172,8 @@
             <w:shd w:val="clear" w:color="auto" w:fill="FFFFFF"/>
           </w:tcPr>
           <w:p>
-            <w:pPr>
-              <w:spacing w:before="40" w:after="40"/>
-            </w:pPr>
             <w:r>
-              <w:rPr>
-                <w:rFonts w:ascii="Calibri" w:hAnsi="Calibri"/>
-                <w:b/>
-                <w:i w:val="0"/>
-                <w:color w:val="16A34A"/>
-                <w:sz w:val="22"/>
-              </w:rPr>
-              <w:t>☐</w:t>
+              <w:t>✅ COMPLETO</w:t>
             </w:r>
           </w:p>
         </w:tc>
@@ -5855,18 +5272,8 @@
             <w:shd w:val="clear" w:color="auto" w:fill="F1F5F9"/>
           </w:tcPr>
           <w:p>
-            <w:pPr>
-              <w:spacing w:before="40" w:after="40"/>
-            </w:pPr>
             <w:r>
-              <w:rPr>
-                <w:rFonts w:ascii="Calibri" w:hAnsi="Calibri"/>
-                <w:b/>
-                <w:i w:val="0"/>
-                <w:color w:val="16A34A"/>
-                <w:sz w:val="22"/>
-              </w:rPr>
-              <w:t>☐</w:t>
+              <w:t>✅ COMPLETO</w:t>
             </w:r>
           </w:p>
         </w:tc>
@@ -5965,18 +5372,8 @@
             <w:shd w:val="clear" w:color="auto" w:fill="FFFFFF"/>
           </w:tcPr>
           <w:p>
-            <w:pPr>
-              <w:spacing w:before="40" w:after="40"/>
-            </w:pPr>
             <w:r>
-              <w:rPr>
-                <w:rFonts w:ascii="Calibri" w:hAnsi="Calibri"/>
-                <w:b/>
-                <w:i w:val="0"/>
-                <w:color w:val="16A34A"/>
-                <w:sz w:val="22"/>
-              </w:rPr>
-              <w:t>☐</w:t>
+              <w:t>✅ COMPLETO</w:t>
             </w:r>
           </w:p>
         </w:tc>
@@ -6075,18 +5472,8 @@
             <w:shd w:val="clear" w:color="auto" w:fill="F1F5F9"/>
           </w:tcPr>
           <w:p>
-            <w:pPr>
-              <w:spacing w:before="40" w:after="40"/>
-            </w:pPr>
             <w:r>
-              <w:rPr>
-                <w:rFonts w:ascii="Calibri" w:hAnsi="Calibri"/>
-                <w:b/>
-                <w:i w:val="0"/>
-                <w:color w:val="16A34A"/>
-                <w:sz w:val="22"/>
-              </w:rPr>
-              <w:t>☐</w:t>
+              <w:t>✅ COMPLETO</w:t>
             </w:r>
           </w:p>
         </w:tc>

</xml_diff>